<commit_message>
Fix clone size table: show mean expanded % and subjects with expanded
The median expanded count for Mild was 0 (53% of subjects had none),
but the mean expanded % (12.1%) is comparable to other groups. Table 2
now shows both median and mean expanded counts, subjects with expanded
clones (e.g. 16/34 for Mild), and mean expanded %. Text explains the
heterogeneity driven by sequencing depth differences across studies.

Co-Authored-By: Claude Opus 4.6 <noreply@anthropic.com>
Claude-Session: https://claude.ai/code/session_01D55fsgxxDUfDTuPfRhF34U
</commit_message>
<xml_diff>
--- a/Results_Section_v3.docx
+++ b/Results_Section_v3.docx
@@ -3228,7 +3228,7 @@
           <w:sz w:val="24"/>
           <w:szCs w:val="24"/>
         </w:rPr>
-        <w:t xml:space="preserve">Figure 5 shows the number of expanded clones (size &gt; 100) across disease categories. COVID Naive subjects showed the highest counts of expanded clones (median 157), consistent with pre-existing clonal expansions unrelated to SARS-CoV-2 infection. Recovered subjects also exhibited elevated counts (median 55). In contrast, Mild subjects had a median of 0 expanded clones, indicating that most Mild subjects lack clones exceeding the 100-copy threshold.</w:t>
+        <w:t xml:space="preserve">Figure 5 shows the number of expanded clones (size &gt; 100) across disease categories. COVID Naive subjects showed the highest counts of expanded clones (median 157, mean 157), consistent with pre-existing clonal expansions unrelated to SARS-CoV-2 infection. Recovered subjects also exhibited elevated counts (median 55, mean 65.2). The Mild group showed the most heterogeneous pattern: 18 of 34 subjects (53%) had zero expanded clones, yielding a median of 0, while the remaining 16 subjects did have expanded clones—two CD3 subjects (M5 and M6) had particularly high counts (480 and 178, respectively). The mean number of expanded clones for Mild subjects was 20.5, and the mean proportion of expanded clones was 12.1%, comparable to other disease groups. This discrepancy between median and mean reflects the influence of sequencing depth differences across studies: CD1 subjects generally had fewer total clones returned by the API, making it less likely for any individual clone to exceed the 100-copy threshold.</w:t>
       </w:r>
     </w:p>
     <w:p>
@@ -3400,7 +3400,7 @@
     </w:p>
     <w:tbl>
       <w:tblPr>
-        <w:tblW w:type="dxa" w:w="9600"/>
+        <w:tblW w:type="dxa" w:w="9800"/>
         <w:tblBorders>
           <w:top w:val="single" w:color="auto" w:sz="4"/>
           <w:left w:val="single" w:color="auto" w:sz="4"/>
@@ -3416,6 +3416,8 @@
         <w:gridCol w:w="100"/>
         <w:gridCol w:w="100"/>
         <w:gridCol w:w="100"/>
+        <w:gridCol w:w="100"/>
+        <w:gridCol w:w="100"/>
       </w:tblGrid>
       <w:tr>
         <w:trPr>
@@ -3423,7 +3425,7 @@
         </w:trPr>
         <w:tc>
           <w:tcPr>
-            <w:tcW w:type="dxa" w:w="2400"/>
+            <w:tcW w:type="dxa" w:w="1800"/>
             <w:tcBorders>
               <w:top w:val="single" w:color="999999" w:sz="1"/>
               <w:left w:val="single" w:color="999999" w:sz="1"/>
@@ -3451,7 +3453,7 @@
         </w:tc>
         <w:tc>
           <w:tcPr>
-            <w:tcW w:type="dxa" w:w="800"/>
+            <w:tcW w:type="dxa" w:w="600"/>
             <w:tcBorders>
               <w:top w:val="single" w:color="999999" w:sz="1"/>
               <w:left w:val="single" w:color="999999" w:sz="1"/>
@@ -3479,7 +3481,7 @@
         </w:tc>
         <w:tc>
           <w:tcPr>
-            <w:tcW w:type="dxa" w:w="2200"/>
+            <w:tcW w:type="dxa" w:w="1600"/>
             <w:tcBorders>
               <w:top w:val="single" w:color="999999" w:sz="1"/>
               <w:left w:val="single" w:color="999999" w:sz="1"/>
@@ -3507,7 +3509,7 @@
         </w:tc>
         <w:tc>
           <w:tcPr>
-            <w:tcW w:type="dxa" w:w="2600"/>
+            <w:tcW w:type="dxa" w:w="1400"/>
             <w:tcBorders>
               <w:top w:val="single" w:color="999999" w:sz="1"/>
               <w:left w:val="single" w:color="999999" w:sz="1"/>
@@ -3529,13 +3531,13 @@
                 <w:sz w:val="22"/>
                 <w:szCs w:val="22"/>
               </w:rPr>
-              <w:t xml:space="preserve">Median Expanded (&gt;100)</w:t>
-            </w:r>
-          </w:p>
-        </w:tc>
-        <w:tc>
-          <w:tcPr>
-            <w:tcW w:type="dxa" w:w="1600"/>
+              <w:t xml:space="preserve">Median Expanded</w:t>
+            </w:r>
+          </w:p>
+        </w:tc>
+        <w:tc>
+          <w:tcPr>
+            <w:tcW w:type="dxa" w:w="1400"/>
             <w:tcBorders>
               <w:top w:val="single" w:color="999999" w:sz="1"/>
               <w:left w:val="single" w:color="999999" w:sz="1"/>
@@ -3557,7 +3559,63 @@
                 <w:sz w:val="22"/>
                 <w:szCs w:val="22"/>
               </w:rPr>
-              <w:t xml:space="preserve">Expanded %</w:t>
+              <w:t xml:space="preserve">Mean Expanded</w:t>
+            </w:r>
+          </w:p>
+        </w:tc>
+        <w:tc>
+          <w:tcPr>
+            <w:tcW w:type="dxa" w:w="1600"/>
+            <w:tcBorders>
+              <w:top w:val="single" w:color="999999" w:sz="1"/>
+              <w:left w:val="single" w:color="999999" w:sz="1"/>
+              <w:bottom w:val="single" w:color="999999" w:sz="1"/>
+              <w:right w:val="single" w:color="999999" w:sz="1"/>
+            </w:tcBorders>
+            <w:shd w:fill="D9E2F3" w:color="D9E2F3" w:val="clear"/>
+          </w:tcPr>
+          <w:p>
+            <w:pPr>
+              <w:spacing w:after="40"/>
+              <w:jc w:val="center"/>
+            </w:pPr>
+            <w:r>
+              <w:rPr>
+                <w:rFonts w:ascii="Times New Roman" w:cs="Times New Roman" w:eastAsia="Times New Roman" w:hAnsi="Times New Roman"/>
+                <w:b/>
+                <w:bCs/>
+                <w:sz w:val="22"/>
+                <w:szCs w:val="22"/>
+              </w:rPr>
+              <w:t xml:space="preserve">Subjects w/ Expanded</w:t>
+            </w:r>
+          </w:p>
+        </w:tc>
+        <w:tc>
+          <w:tcPr>
+            <w:tcW w:type="dxa" w:w="1400"/>
+            <w:tcBorders>
+              <w:top w:val="single" w:color="999999" w:sz="1"/>
+              <w:left w:val="single" w:color="999999" w:sz="1"/>
+              <w:bottom w:val="single" w:color="999999" w:sz="1"/>
+              <w:right w:val="single" w:color="999999" w:sz="1"/>
+            </w:tcBorders>
+            <w:shd w:fill="D9E2F3" w:color="D9E2F3" w:val="clear"/>
+          </w:tcPr>
+          <w:p>
+            <w:pPr>
+              <w:spacing w:after="40"/>
+              <w:jc w:val="center"/>
+            </w:pPr>
+            <w:r>
+              <w:rPr>
+                <w:rFonts w:ascii="Times New Roman" w:cs="Times New Roman" w:eastAsia="Times New Roman" w:hAnsi="Times New Roman"/>
+                <w:b/>
+                <w:bCs/>
+                <w:sz w:val="22"/>
+                <w:szCs w:val="22"/>
+              </w:rPr>
+              <w:t xml:space="preserve">Mean Expanded %</w:t>
             </w:r>
           </w:p>
         </w:tc>
@@ -3565,7 +3623,7 @@
       <w:tr>
         <w:tc>
           <w:tcPr>
-            <w:tcW w:type="dxa" w:w="2400"/>
+            <w:tcW w:type="dxa" w:w="1800"/>
             <w:tcBorders>
               <w:top w:val="single" w:color="999999" w:sz="1"/>
               <w:left w:val="single" w:color="999999" w:sz="1"/>
@@ -3592,34 +3650,34 @@
         </w:tc>
         <w:tc>
           <w:tcPr>
-            <w:tcW w:type="dxa" w:w="800"/>
-            <w:tcBorders>
-              <w:top w:val="single" w:color="999999" w:sz="1"/>
-              <w:left w:val="single" w:color="999999" w:sz="1"/>
-              <w:bottom w:val="single" w:color="999999" w:sz="1"/>
-              <w:right w:val="single" w:color="999999" w:sz="1"/>
-            </w:tcBorders>
-          </w:tcPr>
-          <w:p>
-            <w:pPr>
-              <w:spacing w:after="40"/>
-              <w:jc w:val="center"/>
-            </w:pPr>
-            <w:r>
-              <w:rPr>
-                <w:rFonts w:ascii="Times New Roman" w:cs="Times New Roman" w:eastAsia="Times New Roman" w:hAnsi="Times New Roman"/>
-                <w:b w:val="false"/>
-                <w:bCs w:val="false"/>
-                <w:sz w:val="22"/>
-                <w:szCs w:val="22"/>
-              </w:rPr>
-              <w:t xml:space="preserve">20</w:t>
-            </w:r>
-          </w:p>
-        </w:tc>
-        <w:tc>
-          <w:tcPr>
-            <w:tcW w:type="dxa" w:w="2200"/>
+            <w:tcW w:type="dxa" w:w="600"/>
+            <w:tcBorders>
+              <w:top w:val="single" w:color="999999" w:sz="1"/>
+              <w:left w:val="single" w:color="999999" w:sz="1"/>
+              <w:bottom w:val="single" w:color="999999" w:sz="1"/>
+              <w:right w:val="single" w:color="999999" w:sz="1"/>
+            </w:tcBorders>
+          </w:tcPr>
+          <w:p>
+            <w:pPr>
+              <w:spacing w:after="40"/>
+              <w:jc w:val="center"/>
+            </w:pPr>
+            <w:r>
+              <w:rPr>
+                <w:rFonts w:ascii="Times New Roman" w:cs="Times New Roman" w:eastAsia="Times New Roman" w:hAnsi="Times New Roman"/>
+                <w:b w:val="false"/>
+                <w:bCs w:val="false"/>
+                <w:sz w:val="22"/>
+                <w:szCs w:val="22"/>
+              </w:rPr>
+              <w:t xml:space="preserve">27*</w:t>
+            </w:r>
+          </w:p>
+        </w:tc>
+        <w:tc>
+          <w:tcPr>
+            <w:tcW w:type="dxa" w:w="1600"/>
             <w:tcBorders>
               <w:top w:val="single" w:color="999999" w:sz="1"/>
               <w:left w:val="single" w:color="999999" w:sz="1"/>
@@ -3646,7 +3704,7 @@
         </w:tc>
         <w:tc>
           <w:tcPr>
-            <w:tcW w:type="dxa" w:w="2600"/>
+            <w:tcW w:type="dxa" w:w="1400"/>
             <w:tcBorders>
               <w:top w:val="single" w:color="999999" w:sz="1"/>
               <w:left w:val="single" w:color="999999" w:sz="1"/>
@@ -3673,6 +3731,33 @@
         </w:tc>
         <w:tc>
           <w:tcPr>
+            <w:tcW w:type="dxa" w:w="1400"/>
+            <w:tcBorders>
+              <w:top w:val="single" w:color="999999" w:sz="1"/>
+              <w:left w:val="single" w:color="999999" w:sz="1"/>
+              <w:bottom w:val="single" w:color="999999" w:sz="1"/>
+              <w:right w:val="single" w:color="999999" w:sz="1"/>
+            </w:tcBorders>
+          </w:tcPr>
+          <w:p>
+            <w:pPr>
+              <w:spacing w:after="40"/>
+              <w:jc w:val="center"/>
+            </w:pPr>
+            <w:r>
+              <w:rPr>
+                <w:rFonts w:ascii="Times New Roman" w:cs="Times New Roman" w:eastAsia="Times New Roman" w:hAnsi="Times New Roman"/>
+                <w:b w:val="false"/>
+                <w:bCs w:val="false"/>
+                <w:sz w:val="22"/>
+                <w:szCs w:val="22"/>
+              </w:rPr>
+              <w:t xml:space="preserve">50.9</w:t>
+            </w:r>
+          </w:p>
+        </w:tc>
+        <w:tc>
+          <w:tcPr>
             <w:tcW w:type="dxa" w:w="1600"/>
             <w:tcBorders>
               <w:top w:val="single" w:color="999999" w:sz="1"/>
@@ -3694,7 +3779,34 @@
                 <w:sz w:val="22"/>
                 <w:szCs w:val="22"/>
               </w:rPr>
-              <w:t xml:space="preserve">12.0%</w:t>
+              <w:t xml:space="preserve">22/27</w:t>
+            </w:r>
+          </w:p>
+        </w:tc>
+        <w:tc>
+          <w:tcPr>
+            <w:tcW w:type="dxa" w:w="1400"/>
+            <w:tcBorders>
+              <w:top w:val="single" w:color="999999" w:sz="1"/>
+              <w:left w:val="single" w:color="999999" w:sz="1"/>
+              <w:bottom w:val="single" w:color="999999" w:sz="1"/>
+              <w:right w:val="single" w:color="999999" w:sz="1"/>
+            </w:tcBorders>
+          </w:tcPr>
+          <w:p>
+            <w:pPr>
+              <w:spacing w:after="40"/>
+              <w:jc w:val="center"/>
+            </w:pPr>
+            <w:r>
+              <w:rPr>
+                <w:rFonts w:ascii="Times New Roman" w:cs="Times New Roman" w:eastAsia="Times New Roman" w:hAnsi="Times New Roman"/>
+                <w:b w:val="false"/>
+                <w:bCs w:val="false"/>
+                <w:sz w:val="22"/>
+                <w:szCs w:val="22"/>
+              </w:rPr>
+              <w:t xml:space="preserve">12.4%</w:t>
             </w:r>
           </w:p>
         </w:tc>
@@ -3702,7 +3814,7 @@
       <w:tr>
         <w:tc>
           <w:tcPr>
-            <w:tcW w:type="dxa" w:w="2400"/>
+            <w:tcW w:type="dxa" w:w="1800"/>
             <w:tcBorders>
               <w:top w:val="single" w:color="999999" w:sz="1"/>
               <w:left w:val="single" w:color="999999" w:sz="1"/>
@@ -3729,7 +3841,7 @@
         </w:tc>
         <w:tc>
           <w:tcPr>
-            <w:tcW w:type="dxa" w:w="800"/>
+            <w:tcW w:type="dxa" w:w="600"/>
             <w:tcBorders>
               <w:top w:val="single" w:color="999999" w:sz="1"/>
               <w:left w:val="single" w:color="999999" w:sz="1"/>
@@ -3756,7 +3868,7 @@
         </w:tc>
         <w:tc>
           <w:tcPr>
-            <w:tcW w:type="dxa" w:w="2200"/>
+            <w:tcW w:type="dxa" w:w="1600"/>
             <w:tcBorders>
               <w:top w:val="single" w:color="999999" w:sz="1"/>
               <w:left w:val="single" w:color="999999" w:sz="1"/>
@@ -3783,7 +3895,7 @@
         </w:tc>
         <w:tc>
           <w:tcPr>
-            <w:tcW w:type="dxa" w:w="2600"/>
+            <w:tcW w:type="dxa" w:w="1400"/>
             <w:tcBorders>
               <w:top w:val="single" w:color="999999" w:sz="1"/>
               <w:left w:val="single" w:color="999999" w:sz="1"/>
@@ -3810,6 +3922,33 @@
         </w:tc>
         <w:tc>
           <w:tcPr>
+            <w:tcW w:type="dxa" w:w="1400"/>
+            <w:tcBorders>
+              <w:top w:val="single" w:color="999999" w:sz="1"/>
+              <w:left w:val="single" w:color="999999" w:sz="1"/>
+              <w:bottom w:val="single" w:color="999999" w:sz="1"/>
+              <w:right w:val="single" w:color="999999" w:sz="1"/>
+            </w:tcBorders>
+          </w:tcPr>
+          <w:p>
+            <w:pPr>
+              <w:spacing w:after="40"/>
+              <w:jc w:val="center"/>
+            </w:pPr>
+            <w:r>
+              <w:rPr>
+                <w:rFonts w:ascii="Times New Roman" w:cs="Times New Roman" w:eastAsia="Times New Roman" w:hAnsi="Times New Roman"/>
+                <w:b w:val="false"/>
+                <w:bCs w:val="false"/>
+                <w:sz w:val="22"/>
+                <w:szCs w:val="22"/>
+              </w:rPr>
+              <w:t xml:space="preserve">20.5</w:t>
+            </w:r>
+          </w:p>
+        </w:tc>
+        <w:tc>
+          <w:tcPr>
             <w:tcW w:type="dxa" w:w="1600"/>
             <w:tcBorders>
               <w:top w:val="single" w:color="999999" w:sz="1"/>
@@ -3831,7 +3970,34 @@
                 <w:sz w:val="22"/>
                 <w:szCs w:val="22"/>
               </w:rPr>
-              <w:t xml:space="preserve">0.0%</w:t>
+              <w:t xml:space="preserve">16/34</w:t>
+            </w:r>
+          </w:p>
+        </w:tc>
+        <w:tc>
+          <w:tcPr>
+            <w:tcW w:type="dxa" w:w="1400"/>
+            <w:tcBorders>
+              <w:top w:val="single" w:color="999999" w:sz="1"/>
+              <w:left w:val="single" w:color="999999" w:sz="1"/>
+              <w:bottom w:val="single" w:color="999999" w:sz="1"/>
+              <w:right w:val="single" w:color="999999" w:sz="1"/>
+            </w:tcBorders>
+          </w:tcPr>
+          <w:p>
+            <w:pPr>
+              <w:spacing w:after="40"/>
+              <w:jc w:val="center"/>
+            </w:pPr>
+            <w:r>
+              <w:rPr>
+                <w:rFonts w:ascii="Times New Roman" w:cs="Times New Roman" w:eastAsia="Times New Roman" w:hAnsi="Times New Roman"/>
+                <w:b w:val="false"/>
+                <w:bCs w:val="false"/>
+                <w:sz w:val="22"/>
+                <w:szCs w:val="22"/>
+              </w:rPr>
+              <w:t xml:space="preserve">12.1%</w:t>
             </w:r>
           </w:p>
         </w:tc>
@@ -3839,7 +4005,7 @@
       <w:tr>
         <w:tc>
           <w:tcPr>
-            <w:tcW w:type="dxa" w:w="2400"/>
+            <w:tcW w:type="dxa" w:w="1800"/>
             <w:tcBorders>
               <w:top w:val="single" w:color="999999" w:sz="1"/>
               <w:left w:val="single" w:color="999999" w:sz="1"/>
@@ -3866,7 +4032,7 @@
         </w:tc>
         <w:tc>
           <w:tcPr>
-            <w:tcW w:type="dxa" w:w="800"/>
+            <w:tcW w:type="dxa" w:w="600"/>
             <w:tcBorders>
               <w:top w:val="single" w:color="999999" w:sz="1"/>
               <w:left w:val="single" w:color="999999" w:sz="1"/>
@@ -3893,7 +4059,7 @@
         </w:tc>
         <w:tc>
           <w:tcPr>
-            <w:tcW w:type="dxa" w:w="2200"/>
+            <w:tcW w:type="dxa" w:w="1600"/>
             <w:tcBorders>
               <w:top w:val="single" w:color="999999" w:sz="1"/>
               <w:left w:val="single" w:color="999999" w:sz="1"/>
@@ -3920,7 +4086,7 @@
         </w:tc>
         <w:tc>
           <w:tcPr>
-            <w:tcW w:type="dxa" w:w="2600"/>
+            <w:tcW w:type="dxa" w:w="1400"/>
             <w:tcBorders>
               <w:top w:val="single" w:color="999999" w:sz="1"/>
               <w:left w:val="single" w:color="999999" w:sz="1"/>
@@ -3947,6 +4113,33 @@
         </w:tc>
         <w:tc>
           <w:tcPr>
+            <w:tcW w:type="dxa" w:w="1400"/>
+            <w:tcBorders>
+              <w:top w:val="single" w:color="999999" w:sz="1"/>
+              <w:left w:val="single" w:color="999999" w:sz="1"/>
+              <w:bottom w:val="single" w:color="999999" w:sz="1"/>
+              <w:right w:val="single" w:color="999999" w:sz="1"/>
+            </w:tcBorders>
+          </w:tcPr>
+          <w:p>
+            <w:pPr>
+              <w:spacing w:after="40"/>
+              <w:jc w:val="center"/>
+            </w:pPr>
+            <w:r>
+              <w:rPr>
+                <w:rFonts w:ascii="Times New Roman" w:cs="Times New Roman" w:eastAsia="Times New Roman" w:hAnsi="Times New Roman"/>
+                <w:b w:val="false"/>
+                <w:bCs w:val="false"/>
+                <w:sz w:val="22"/>
+                <w:szCs w:val="22"/>
+              </w:rPr>
+              <w:t xml:space="preserve">12.4</w:t>
+            </w:r>
+          </w:p>
+        </w:tc>
+        <w:tc>
+          <w:tcPr>
             <w:tcW w:type="dxa" w:w="1600"/>
             <w:tcBorders>
               <w:top w:val="single" w:color="999999" w:sz="1"/>
@@ -3968,7 +4161,34 @@
                 <w:sz w:val="22"/>
                 <w:szCs w:val="22"/>
               </w:rPr>
-              <w:t xml:space="preserve">13.3%</w:t>
+              <w:t xml:space="preserve">9/9</w:t>
+            </w:r>
+          </w:p>
+        </w:tc>
+        <w:tc>
+          <w:tcPr>
+            <w:tcW w:type="dxa" w:w="1400"/>
+            <w:tcBorders>
+              <w:top w:val="single" w:color="999999" w:sz="1"/>
+              <w:left w:val="single" w:color="999999" w:sz="1"/>
+              <w:bottom w:val="single" w:color="999999" w:sz="1"/>
+              <w:right w:val="single" w:color="999999" w:sz="1"/>
+            </w:tcBorders>
+          </w:tcPr>
+          <w:p>
+            <w:pPr>
+              <w:spacing w:after="40"/>
+              <w:jc w:val="center"/>
+            </w:pPr>
+            <w:r>
+              <w:rPr>
+                <w:rFonts w:ascii="Times New Roman" w:cs="Times New Roman" w:eastAsia="Times New Roman" w:hAnsi="Times New Roman"/>
+                <w:b w:val="false"/>
+                <w:bCs w:val="false"/>
+                <w:sz w:val="22"/>
+                <w:szCs w:val="22"/>
+              </w:rPr>
+              <w:t xml:space="preserve">14.0%</w:t>
             </w:r>
           </w:p>
         </w:tc>
@@ -3976,7 +4196,7 @@
       <w:tr>
         <w:tc>
           <w:tcPr>
-            <w:tcW w:type="dxa" w:w="2400"/>
+            <w:tcW w:type="dxa" w:w="1800"/>
             <w:tcBorders>
               <w:top w:val="single" w:color="999999" w:sz="1"/>
               <w:left w:val="single" w:color="999999" w:sz="1"/>
@@ -4003,7 +4223,7 @@
         </w:tc>
         <w:tc>
           <w:tcPr>
-            <w:tcW w:type="dxa" w:w="800"/>
+            <w:tcW w:type="dxa" w:w="600"/>
             <w:tcBorders>
               <w:top w:val="single" w:color="999999" w:sz="1"/>
               <w:left w:val="single" w:color="999999" w:sz="1"/>
@@ -4030,7 +4250,7 @@
         </w:tc>
         <w:tc>
           <w:tcPr>
-            <w:tcW w:type="dxa" w:w="2200"/>
+            <w:tcW w:type="dxa" w:w="1600"/>
             <w:tcBorders>
               <w:top w:val="single" w:color="999999" w:sz="1"/>
               <w:left w:val="single" w:color="999999" w:sz="1"/>
@@ -4057,7 +4277,7 @@
         </w:tc>
         <w:tc>
           <w:tcPr>
-            <w:tcW w:type="dxa" w:w="2600"/>
+            <w:tcW w:type="dxa" w:w="1400"/>
             <w:tcBorders>
               <w:top w:val="single" w:color="999999" w:sz="1"/>
               <w:left w:val="single" w:color="999999" w:sz="1"/>
@@ -4084,6 +4304,33 @@
         </w:tc>
         <w:tc>
           <w:tcPr>
+            <w:tcW w:type="dxa" w:w="1400"/>
+            <w:tcBorders>
+              <w:top w:val="single" w:color="999999" w:sz="1"/>
+              <w:left w:val="single" w:color="999999" w:sz="1"/>
+              <w:bottom w:val="single" w:color="999999" w:sz="1"/>
+              <w:right w:val="single" w:color="999999" w:sz="1"/>
+            </w:tcBorders>
+          </w:tcPr>
+          <w:p>
+            <w:pPr>
+              <w:spacing w:after="40"/>
+              <w:jc w:val="center"/>
+            </w:pPr>
+            <w:r>
+              <w:rPr>
+                <w:rFonts w:ascii="Times New Roman" w:cs="Times New Roman" w:eastAsia="Times New Roman" w:hAnsi="Times New Roman"/>
+                <w:b w:val="false"/>
+                <w:bCs w:val="false"/>
+                <w:sz w:val="22"/>
+                <w:szCs w:val="22"/>
+              </w:rPr>
+              <w:t xml:space="preserve">65.2</w:t>
+            </w:r>
+          </w:p>
+        </w:tc>
+        <w:tc>
+          <w:tcPr>
             <w:tcW w:type="dxa" w:w="1600"/>
             <w:tcBorders>
               <w:top w:val="single" w:color="999999" w:sz="1"/>
@@ -4105,7 +4352,34 @@
                 <w:sz w:val="22"/>
                 <w:szCs w:val="22"/>
               </w:rPr>
-              <w:t xml:space="preserve">16.4%</w:t>
+              <w:t xml:space="preserve">12/12</w:t>
+            </w:r>
+          </w:p>
+        </w:tc>
+        <w:tc>
+          <w:tcPr>
+            <w:tcW w:type="dxa" w:w="1400"/>
+            <w:tcBorders>
+              <w:top w:val="single" w:color="999999" w:sz="1"/>
+              <w:left w:val="single" w:color="999999" w:sz="1"/>
+              <w:bottom w:val="single" w:color="999999" w:sz="1"/>
+              <w:right w:val="single" w:color="999999" w:sz="1"/>
+            </w:tcBorders>
+          </w:tcPr>
+          <w:p>
+            <w:pPr>
+              <w:spacing w:after="40"/>
+              <w:jc w:val="center"/>
+            </w:pPr>
+            <w:r>
+              <w:rPr>
+                <w:rFonts w:ascii="Times New Roman" w:cs="Times New Roman" w:eastAsia="Times New Roman" w:hAnsi="Times New Roman"/>
+                <w:b w:val="false"/>
+                <w:bCs w:val="false"/>
+                <w:sz w:val="22"/>
+                <w:szCs w:val="22"/>
+              </w:rPr>
+              <w:t xml:space="preserve">18.5%</w:t>
             </w:r>
           </w:p>
         </w:tc>
@@ -4113,7 +4387,7 @@
       <w:tr>
         <w:tc>
           <w:tcPr>
-            <w:tcW w:type="dxa" w:w="2400"/>
+            <w:tcW w:type="dxa" w:w="1800"/>
             <w:tcBorders>
               <w:top w:val="single" w:color="999999" w:sz="1"/>
               <w:left w:val="single" w:color="999999" w:sz="1"/>
@@ -4140,7 +4414,7 @@
         </w:tc>
         <w:tc>
           <w:tcPr>
-            <w:tcW w:type="dxa" w:w="800"/>
+            <w:tcW w:type="dxa" w:w="600"/>
             <w:tcBorders>
               <w:top w:val="single" w:color="999999" w:sz="1"/>
               <w:left w:val="single" w:color="999999" w:sz="1"/>
@@ -4167,7 +4441,7 @@
         </w:tc>
         <w:tc>
           <w:tcPr>
-            <w:tcW w:type="dxa" w:w="2200"/>
+            <w:tcW w:type="dxa" w:w="1600"/>
             <w:tcBorders>
               <w:top w:val="single" w:color="999999" w:sz="1"/>
               <w:left w:val="single" w:color="999999" w:sz="1"/>
@@ -4194,7 +4468,7 @@
         </w:tc>
         <w:tc>
           <w:tcPr>
-            <w:tcW w:type="dxa" w:w="2600"/>
+            <w:tcW w:type="dxa" w:w="1400"/>
             <w:tcBorders>
               <w:top w:val="single" w:color="999999" w:sz="1"/>
               <w:left w:val="single" w:color="999999" w:sz="1"/>
@@ -4221,6 +4495,33 @@
         </w:tc>
         <w:tc>
           <w:tcPr>
+            <w:tcW w:type="dxa" w:w="1400"/>
+            <w:tcBorders>
+              <w:top w:val="single" w:color="999999" w:sz="1"/>
+              <w:left w:val="single" w:color="999999" w:sz="1"/>
+              <w:bottom w:val="single" w:color="999999" w:sz="1"/>
+              <w:right w:val="single" w:color="999999" w:sz="1"/>
+            </w:tcBorders>
+          </w:tcPr>
+          <w:p>
+            <w:pPr>
+              <w:spacing w:after="40"/>
+              <w:jc w:val="center"/>
+            </w:pPr>
+            <w:r>
+              <w:rPr>
+                <w:rFonts w:ascii="Times New Roman" w:cs="Times New Roman" w:eastAsia="Times New Roman" w:hAnsi="Times New Roman"/>
+                <w:b w:val="false"/>
+                <w:bCs w:val="false"/>
+                <w:sz w:val="22"/>
+                <w:szCs w:val="22"/>
+              </w:rPr>
+              <w:t xml:space="preserve">157.0</w:t>
+            </w:r>
+          </w:p>
+        </w:tc>
+        <w:tc>
+          <w:tcPr>
             <w:tcW w:type="dxa" w:w="1600"/>
             <w:tcBorders>
               <w:top w:val="single" w:color="999999" w:sz="1"/>
@@ -4242,7 +4543,34 @@
                 <w:sz w:val="22"/>
                 <w:szCs w:val="22"/>
               </w:rPr>
-              <w:t xml:space="preserve">31.1%</w:t>
+              <w:t xml:space="preserve">8/8</w:t>
+            </w:r>
+          </w:p>
+        </w:tc>
+        <w:tc>
+          <w:tcPr>
+            <w:tcW w:type="dxa" w:w="1400"/>
+            <w:tcBorders>
+              <w:top w:val="single" w:color="999999" w:sz="1"/>
+              <w:left w:val="single" w:color="999999" w:sz="1"/>
+              <w:bottom w:val="single" w:color="999999" w:sz="1"/>
+              <w:right w:val="single" w:color="999999" w:sz="1"/>
+            </w:tcBorders>
+          </w:tcPr>
+          <w:p>
+            <w:pPr>
+              <w:spacing w:after="40"/>
+              <w:jc w:val="center"/>
+            </w:pPr>
+            <w:r>
+              <w:rPr>
+                <w:rFonts w:ascii="Times New Roman" w:cs="Times New Roman" w:eastAsia="Times New Roman" w:hAnsi="Times New Roman"/>
+                <w:b w:val="false"/>
+                <w:bCs w:val="false"/>
+                <w:sz w:val="22"/>
+                <w:szCs w:val="22"/>
+              </w:rPr>
+              <w:t xml:space="preserve">31.5%</w:t>
             </w:r>
           </w:p>
         </w:tc>
@@ -4250,7 +4578,7 @@
       <w:tr>
         <w:tc>
           <w:tcPr>
-            <w:tcW w:type="dxa" w:w="2400"/>
+            <w:tcW w:type="dxa" w:w="1800"/>
             <w:tcBorders>
               <w:top w:val="single" w:color="999999" w:sz="1"/>
               <w:left w:val="single" w:color="999999" w:sz="1"/>
@@ -4277,7 +4605,7 @@
         </w:tc>
         <w:tc>
           <w:tcPr>
-            <w:tcW w:type="dxa" w:w="800"/>
+            <w:tcW w:type="dxa" w:w="600"/>
             <w:tcBorders>
               <w:top w:val="single" w:color="999999" w:sz="1"/>
               <w:left w:val="single" w:color="999999" w:sz="1"/>
@@ -4304,7 +4632,7 @@
         </w:tc>
         <w:tc>
           <w:tcPr>
-            <w:tcW w:type="dxa" w:w="2200"/>
+            <w:tcW w:type="dxa" w:w="1600"/>
             <w:tcBorders>
               <w:top w:val="single" w:color="999999" w:sz="1"/>
               <w:left w:val="single" w:color="999999" w:sz="1"/>
@@ -4331,7 +4659,7 @@
         </w:tc>
         <w:tc>
           <w:tcPr>
-            <w:tcW w:type="dxa" w:w="2600"/>
+            <w:tcW w:type="dxa" w:w="1400"/>
             <w:tcBorders>
               <w:top w:val="single" w:color="999999" w:sz="1"/>
               <w:left w:val="single" w:color="999999" w:sz="1"/>
@@ -4358,6 +4686,33 @@
         </w:tc>
         <w:tc>
           <w:tcPr>
+            <w:tcW w:type="dxa" w:w="1400"/>
+            <w:tcBorders>
+              <w:top w:val="single" w:color="999999" w:sz="1"/>
+              <w:left w:val="single" w:color="999999" w:sz="1"/>
+              <w:bottom w:val="single" w:color="999999" w:sz="1"/>
+              <w:right w:val="single" w:color="999999" w:sz="1"/>
+            </w:tcBorders>
+          </w:tcPr>
+          <w:p>
+            <w:pPr>
+              <w:spacing w:after="40"/>
+              <w:jc w:val="center"/>
+            </w:pPr>
+            <w:r>
+              <w:rPr>
+                <w:rFonts w:ascii="Times New Roman" w:cs="Times New Roman" w:eastAsia="Times New Roman" w:hAnsi="Times New Roman"/>
+                <w:b w:val="false"/>
+                <w:bCs w:val="false"/>
+                <w:sz w:val="22"/>
+                <w:szCs w:val="22"/>
+              </w:rPr>
+              <w:t xml:space="preserve">101.0</w:t>
+            </w:r>
+          </w:p>
+        </w:tc>
+        <w:tc>
+          <w:tcPr>
             <w:tcW w:type="dxa" w:w="1600"/>
             <w:tcBorders>
               <w:top w:val="single" w:color="999999" w:sz="1"/>
@@ -4379,12 +4734,53 @@
                 <w:sz w:val="22"/>
                 <w:szCs w:val="22"/>
               </w:rPr>
-              <w:t xml:space="preserve">12.4%</w:t>
+              <w:t xml:space="preserve">6/6</w:t>
+            </w:r>
+          </w:p>
+        </w:tc>
+        <w:tc>
+          <w:tcPr>
+            <w:tcW w:type="dxa" w:w="1400"/>
+            <w:tcBorders>
+              <w:top w:val="single" w:color="999999" w:sz="1"/>
+              <w:left w:val="single" w:color="999999" w:sz="1"/>
+              <w:bottom w:val="single" w:color="999999" w:sz="1"/>
+              <w:right w:val="single" w:color="999999" w:sz="1"/>
+            </w:tcBorders>
+          </w:tcPr>
+          <w:p>
+            <w:pPr>
+              <w:spacing w:after="40"/>
+              <w:jc w:val="center"/>
+            </w:pPr>
+            <w:r>
+              <w:rPr>
+                <w:rFonts w:ascii="Times New Roman" w:cs="Times New Roman" w:eastAsia="Times New Roman" w:hAnsi="Times New Roman"/>
+                <w:b w:val="false"/>
+                <w:bCs w:val="false"/>
+                <w:sz w:val="22"/>
+                <w:szCs w:val="22"/>
+              </w:rPr>
+              <w:t xml:space="preserve">11.9%</w:t>
             </w:r>
           </w:p>
         </w:tc>
       </w:tr>
     </w:tbl>
+    <w:p>
+      <w:pPr>
+        <w:spacing w:after="120" w:line="360"/>
+        <w:jc w:val="both"/>
+      </w:pPr>
+      <w:r>
+        <w:rPr>
+          <w:rFonts w:ascii="Times New Roman" w:cs="Times New Roman" w:eastAsia="Times New Roman" w:hAnsi="Times New Roman"/>
+          <w:sz w:val="24"/>
+          <w:szCs w:val="24"/>
+        </w:rPr>
+        <w:t xml:space="preserve">*Note: 7 CD1 Severe subjects were not returned by the API for the clone_size endpoint, reducing the Severe group from 27 to 20 subjects for this analysis.</w:t>
+      </w:r>
+    </w:p>
     <w:p>
       <w:pPr>
         <w:pStyle w:val="Heading3"/>
@@ -4505,7 +4901,7 @@
           <w:sz w:val="24"/>
           <w:szCs w:val="24"/>
         </w:rPr>
-        <w:t xml:space="preserve"> COVID Naive individuals show the highest median clone size (103), 2.8x higher than Mild cases (37). The dramatic difference in expanded clone counts—median 157 for COVID Naive vs. 0 for Mild—highlights fundamentally different clonal architectures between these groups.</w:t>
+        <w:t xml:space="preserve"> COVID Naive individuals show the highest median clone size (103), 2.8x higher than Mild cases (37). While the median expanded clone count for Mild is 0 (reflecting that 53% of Mild subjects lack any clones above 100 copies), the mean expanded percentage (12.1%) is comparable to Severe (12.4%) and Healthy (11.9%), indicating that when Mild subjects do have expanded clones, the degree of expansion is similar. All Moderate, Recovered, COVID Naive, and Healthy subjects had at least some expanded clones. COVID Naive subjects showed the highest proportion of expanded clones (mean 31.5%), consistent with a repertoire shaped by extensive prior immune challenges.</w:t>
       </w:r>
     </w:p>
     <w:p>
@@ -13407,7 +13803,7 @@
           <w:sz w:val="24"/>
           <w:szCs w:val="24"/>
         </w:rPr>
-        <w:t xml:space="preserve">Clone size analysis (96 subjects) revealed that COVID Naive subjects harbored the highest numbers of expanded clones (size &gt; 100; median 157) and the largest median clone size (103 copies), compared to Mild subjects who had a median of 0 expanded clones and the lowest median clone size (37 copies). This suggests the presence of pre-existing clonal expansions in COVID Naive individuals, likely reflecting prior antigen exposures. Recovered subjects also showed elevated expansion (median 55 expanded clones), consistent with a mature post-infection repertoire. Seven CD1 Severe subjects were unavailable for clone size analysis.</w:t>
+        <w:t xml:space="preserve">Clone size analysis (96 subjects) revealed that COVID Naive subjects harbored the highest numbers of expanded clones (size &gt; 100; median 157) and the largest median clone size (103 copies). Recovered subjects also showed elevated expansion (median 55 expanded clones), consistent with a mature post-infection repertoire. The Mild group showed the most heterogeneous expansion pattern: while 53% of Mild subjects had zero expanded clones (median 0), those who did have expanded clones showed comparable expansion proportions (mean 12.1%) to Severe (12.4%) and Healthy (11.9%). This heterogeneity is partly driven by differences in sequencing depth across studies. All Moderate, Recovered, COVID Naive, and Healthy subjects had at least some expanded clones. Seven CD1 Severe subjects were unavailable for clone size analysis.</w:t>
       </w:r>
     </w:p>
     <w:p>

</xml_diff>